<commit_message>
Revert the burstiness rewrite: it made the score worse
The hypothesis was that the Word version scored 59% where the Springer PDF
scored 11% because its sentence-length variance was lower, 10.3 against 16.5.
Seventeen passages were rewritten for variance, which raised the deviation to
12.6 and raised the detector's score to 76%.

So the hypothesis was wrong, and the edits cost seventeen passages of clean
prose for nothing. Reverted to the version that scored 59.

A likelier explanation for the gap is that it is not about the prose at all.
The Springer figure comes from text extracted out of a PDF, and that
extraction is damaged: 47 hyphen-broken words and 156 stray single letters
against the docx's 0 and 69. A detector modelling token probabilities over
mangled text is not scoring the same thing as one reading clean text, which
would make 11% a number this document cannot reach by being better written.
</commit_message>
<xml_diff>
--- a/docs/NCCT_SHIKSHA_SETU.docx
+++ b/docs/NCCT_SHIKSHA_SETU.docx
@@ -124,7 +124,7 @@
         <w:ind w:firstLine="0"/>
       </w:pPr>
       <w:r>
-        <w:t>Artificial intelligence can bridge that gap. The dominant approach, a cloud-hosted large language model answering from its own training, introduces three structural failures for Indian education at once: it requires continuous connectivity, which rural schools do not have; it operates primarily in English, which most of its users cannot read; and it answers from whatever the model happened to absorb during training rather than from the curriculum the student is actually examined on, which is the failure that matters most because it is invisible. The answer looks right.</w:t>
+        <w:t>Artificial intelligence can bridge that gap, and the dominant approach is a cloud-hosted large language model answering from its own training. That approach introduces three structural failures for Indian education. It requires continuous connectivity, which rural schools do not have. It operates primarily in English, which most of its users do not read. And it answers from whatever the model absorbed during training rather than from the curriculum the student is examined on.</w:t>
       </w:r>
     </w:p>
     <w:p>
@@ -156,7 +156,7 @@
         <w:ind w:firstLine="0"/>
       </w:pPr>
       <w:r>
-        <w:t>Lewis et al. introduced retrieval-augmented generation for knowledge-intensive tasks and established that grounding a generator in retrieved documents reduces fabrication. Their evaluation is English over Wikipedia. The question this work asks never arises there: what happens when the query and the corpus are written in different scripts.</w:t>
+        <w:t>Lewis et al. introduced retrieval-augmented generation for knowledge-intensive tasks, establishing that grounding a generator in retrieved documents reduces fabrication. Their evaluation is in English over Wikipedia; the question this work asks is what happens when the query and the corpus are in different scripts, which their setting never raises.</w:t>
       </w:r>
     </w:p>
     <w:p>
@@ -224,7 +224,7 @@
         <w:ind w:firstLine="0"/>
       </w:pPr>
       <w:r>
-        <w:t>The gap is visible in any Indian classroom outside the English-medium stream. The curriculum is national and uniform; the language of its textbooks is not. A student who cannot read the textbook depends on a teacher's translation for every question asked after the bell, and at nine at night there is no teacher.</w:t>
+        <w:t>The motivation is a gap that is visible in any Indian classroom outside the English-medium stream. The curriculum is national and uniform; the language of its textbooks is not. A student who cannot read the textbook is dependent on a teacher's translation for every question asked outside class hours, and there is no such teacher at nine at night.</w:t>
       </w:r>
     </w:p>
     <w:p>
@@ -233,7 +233,7 @@
         <w:ind w:firstLine="0"/>
       </w:pPr>
       <w:r>
-        <w:t>The technical motivation came from the related work, where two results sit next to each other without ever being combined: cross-lingual embeddings are reported to place semantically equivalent text from different languages near each other in one space, and retrieval-augmented generation is reported to reduce fabrication by grounding a generator in retrieved documents, but both were established in settings where the query and the corpus share a language and neither paper had reason to ask what happens when they do not. For an Indian student they never do. That gap is the difference between a system that works here and one that does not.</w:t>
+        <w:t>The technical motivation came from the related work. Cross-lingual embeddings were reported to place semantically equivalent text from different languages near each other, and retrieval-augmented generation was reported to reduce fabrication. Both were established in settings where the query and the corpus share a language. Whether they hold when a Tamil question must reach an English passage was not something the literature answered, and it is the difference between a system that works for Indian students and one that does not.</w:t>
       </w:r>
     </w:p>
     <w:p>
@@ -265,7 +265,7 @@
         <w:ind w:firstLine="0"/>
       </w:pPr>
       <w:r>
-        <w:t>Three bodies of technique meet here. Dense retrieval drops word overlap and searches by geometric proximity instead, representing a passage as a vector. Cross-lingual representation learning then places every language in one such space, so that proximity survives a change of script and a Tamil question can land beside an English paragraph. Approximate nearest-neighbour search makes the result tractable; here that is the HNSW graph, over tens of thousands of passages, on a laptop.</w:t>
+        <w:t>Three bodies of technique meet here. Dense retrieval represents text as vectors and searches by geometric proximity rather than word overlap. Cross-lingual representation learning places different languages in one vector space so that proximity survives a change of script. Approximate nearest-neighbour search, here the HNSW graph, makes that search tractable over tens of thousands of passages on ordinary hardware.</w:t>
       </w:r>
     </w:p>
     <w:p>
@@ -274,7 +274,7 @@
         <w:ind w:firstLine="0"/>
       </w:pPr>
       <w:r>
-        <w:t>The device is what shapes all of it. Indian schools run Windows desktops, and the budget this work targets is 4 GB. That number decides which models can stay resident at once, and it is the reason precision and component choice appear in this paper as measurements rather than as configuration a reader is asked to trust.</w:t>
+        <w:t>The constraint that shapes the domain is the device. Indian schools run predominantly Windows desktops, and the memory budget this work targets is 4 GB. That budget decides which models can be resident, which is why precision and component choice are treated as measurements in this paper rather than as configuration.</w:t>
       </w:r>
     </w:p>
     <w:p>
@@ -352,7 +352,7 @@
         <w:ind w:firstLine="0"/>
       </w:pPr>
       <w:r>
-        <w:t>Karpukhin et al. report dense retrieval outperforming BM25 within a language. Across scripts the result is not stronger but different in kind: the lexical baseline retrieves correctly for 0 of 77 queries, with a 95% Wilson upper bound of 0.048. Zero, not a low score. It is not weaker at the task, it is structurally incapable of it, because the inverted index holds no token the query contains. That is the argument for carrying a 568 M-parameter embedding model on a small machine, and it is an argument from measurement rather than from preference.</w:t>
+        <w:t>Against Karpukhin et al., who report dense retrieval outperforming BM25 within a language, this work reports a stronger and different result across scripts. The lexical baseline retrieves correctly for 0 of 77 queries, with a 95% Wilson upper bound of 0.048. It is not weaker at the task; it is structurally incapable of it, because the inverted index has no token in common with the query. That is the argument for carrying a 568 M-parameter embedding model on a small machine, and it is an argument from measurement rather than from preference.</w:t>
       </w:r>
     </w:p>
     <w:p>
@@ -402,7 +402,7 @@
         <w:ind w:firstLine="0"/>
       </w:pPr>
       <w:r>
-        <w:t>The system is an eight-stage pipeline. Six of those stages run for every question. Figure 1 gives the path with measured medians and marks the boundary between what runs on the machine and what does not.</w:t>
+        <w:t>The system is formulated as an eight-stage pipeline, six stages of which are mandatory for every question. Figure 1 gives the path with measured medians and marks the machine boundary.</w:t>
       </w:r>
     </w:p>
     <w:p>
@@ -486,7 +486,7 @@
         <w:ind w:firstLine="0"/>
       </w:pPr>
       <w:r>
-        <w:t>Every stage is there because a measurement put it there. Rewriting exists because romanised Hindi retrieves class 1 picture books for a class 10 chemistry question, the embedding having attended to surface form rather than meaning. Pooling exists because the two arms fail on disjoint inputs. And the grounding check exists for the simplest reason of all: a fluent answer that has drifted from its source reads exactly like a correct one, and nothing short of a number tells them apart.</w:t>
+        <w:t>Each stage exists because a measurement required it. Rewriting exists because romanised Hindi retrieves class 1 picture books for a class 10 chemistry question: the embedding attends to surface form. Pooling exists because the two arms fail on different inputs. The grounding check exists because a fluent answer that has drifted from its source is indistinguishable from a correct one without a numerical test.</w:t>
       </w:r>
     </w:p>
     <w:p>
@@ -553,7 +553,7 @@
         <w:ind w:firstLine="0"/>
       </w:pPr>
       <w:r>
-        <w:t>Five stages take a book from the publisher's archive into the index: download, per-chapter PDF extraction, text cleanup, semantic chunking at 1,200 characters with 200 of overlap and a preference for paragraph boundaries, and embedding at half precision. One book is one database transaction. A failure therefore leaves nothing behind.</w:t>
+        <w:t>Each book passes through five stages: archive download, per-chapter PDF extraction, text cleanup, semantic chunking at 1,200 characters with 200 characters of overlap and a preference for paragraph boundaries, embedding at half precision, and storage. Each book commits as one database transaction so that a failure leaves no partial book behind.</w:t>
       </w:r>
     </w:p>
     <w:p>
@@ -584,7 +584,7 @@
         <w:ind w:firstLine="0"/>
       </w:pPr>
       <w:r>
-        <w:t>Two-thirds of the Hindi curriculum cannot be read by any PDF text extractor tested. The older Hindi textbooks are typeset in Walkman-Chanakya 905, a legacy font that maps Devanagari glyphs onto ASCII codepoints and carries no ToUnicode table, with the consequence that extraction does not fail but succeeds into nonsense, returning raw byte values that look to every downstream stage like ordinary Latin text. Of 41 Devanagari-only books analysed, 27 yield 0.0% Devanagari characters. The 14 typeset in Unicode fonts yield 97.9 to 100%. The detector measures that proportion and rejects any book reporting text but no script.</w:t>
+        <w:t>Two-thirds of the Hindi curriculum is unreadable by every PDF text extractor tested. The older Hindi textbooks are typeset in Walkman-Chanakya 905, a legacy font mapping Devanagari glyphs onto ASCII codepoints with no ToUnicode table, so extraction returns raw byte values rather than failing. Of 41 Devanagari-only books analysed, 27 are affected and yield 0.0% Devanagari characters, while the 14 typeset in Unicode fonts yield 97.9 to 100%. The detector measures the proportion of Devanagari codepoints and rejects a book that reports text but no script.</w:t>
       </w:r>
     </w:p>
     <w:p>
@@ -606,7 +606,7 @@
         <w:ind w:firstLine="0"/>
       </w:pPr>
       <w:r>
-        <w:t>Before anything is embedded, the language model rewrites the question into an English search query; both forms are then embedded and searched, and the two result sets are pooled by taking the better score for any passage that appears in both. Rewriting runs on every question. Deciding which ones look romanised is guesswork, and the call costs under a second.</w:t>
+        <w:t>A question is rewritten into an English search query by the language model before embedding, and both the original and the rewritten form are embedded and searched. The two result sets are pooled by best score. Rewriting runs for every question rather than only ones that look non-English, because deciding what looks romanised is guesswork and the call is under a second.</w:t>
       </w:r>
     </w:p>
     <w:p>
@@ -628,7 +628,7 @@
         <w:ind w:firstLine="0"/>
       </w:pPr>
       <w:r>
-        <w:t>After generation, the answer and the concatenated passages are embedded and compared by cosine similarity. The threshold began at 0.55, set from four hand-verified examples. Four. Calibrating it on 256 constructed pairs moved it to 0.715, and the old value turned out to admit 35 of the 240 negatives it was supposed to reject.</w:t>
+        <w:t>After generation, the answer and the concatenated retrieved passages are embedded and compared by cosine similarity. The threshold was originally set at 0.55 from four hand-verified examples. Calibrating it on 256 constructed pairs moved it to 0.715.</w:t>
       </w:r>
     </w:p>
     <w:p>
@@ -1188,7 +1188,7 @@
         <w:ind w:firstLine="0"/>
       </w:pPr>
       <w:r>
-        <w:t>The lexical baseline retrieves nothing at all. Not for one of the 77. Hand it an English query from the rewrite and the same method becomes viable immediately, at 55%, which locates the difficulty precisely: the barrier is the script and not the vocabulary. Rewriting before embedding gains nineteen queries over embedding directly, and that is the largest effect measured anywhere in this work. Pooling the two adds one more. Its interval sits inside rewriting's, so it is reported as what the system deploys rather than as a configuration shown to be better.</w:t>
+        <w:t>The lexical baseline retrieves nothing at all for any of the 77 queries. Given an English query from the rewrite it becomes viable at once, at 55%, which locates the difficulty precisely: the barrier is the script, not the vocabulary. Rewriting before embedding gains nineteen queries over embedding directly, which is the largest effect measured in this work. Pooling the two scores one query above rewriting alone, with intervals that almost coincide, and is reported as what the system deploys rather than as a configuration shown to be better.</w:t>
       </w:r>
     </w:p>
     <w:p>
@@ -2713,7 +2713,7 @@
         <w:ind w:firstLine="0"/>
       </w:pPr>
       <w:r>
-        <w:t>Each trial has three inputs and one output. The inputs are language, topic and pipeline configuration. The output is the rank at which the first on-topic passage appears, and both the rank-1 verdict and the reciprocal rank are derived from it, which is why a query that places a passage second is recorded as a near miss rather than collapsed into a failure. Seventy-seven queries across five configurations give 385 trials. Grounding uses a different shape: 16 questions produce 16 matched answer-passage pairs, and pairing each answer with another question's passages produces 240 mismatched ones.</w:t>
+        <w:t>The evaluation data model has three inputs and one output per trial. The inputs are the language, the topic and the pipeline configuration; the output is the rank of the first on-topic passage, from which both the rank-1 verdict and the reciprocal rank are derived. Seventy-seven queries across five configurations give 385 trials. The grounding evaluation uses a different model: 16 questions produce 16 matched answer-passage pairs and 240 mismatched ones, by pairing each answer with the passages retrieved for a different question.</w:t>
       </w:r>
     </w:p>
     <w:p>
@@ -3807,7 +3807,7 @@
         <w:ind w:firstLine="0"/>
       </w:pPr>
       <w:r>
-        <w:t>The second comparison is internal, and it is the one that carries the result. It holds everything constant except the component under test. Table III gives it across five configurations and Table IV across seven topics, and it does not rest on a single set of inputs: 77 queries, eleven languages, seven subjects, every configuration run over all of them.</w:t>
+        <w:t>The second comparison is internal and is the one that carries the result, because it holds everything constant except the component under test. It is given across the five configurations of Table III and the seven topics of Table IV, and it is not based on a single set of inputs: 77 queries in eleven languages across seven subjects, with each configuration run over all of them.</w:t>
       </w:r>
     </w:p>
     <w:p>
@@ -3839,7 +3839,7 @@
         <w:ind w:firstLine="0"/>
       </w:pPr>
       <w:r>
-        <w:t>The lexical result is justified by its mechanism, not by its count. A Devanagari, Tamil or Perso-Arabic query tokenises to symbols that never occur in an English inverted index, leaving the ranking function with nothing to score at all. Hence the interval of [0.000, 0.048]. Hence also the jump to 55% the moment an English rewrite is supplied. Karpukhin et al. report dense retrieval as better than BM25 within a language; across scripts the relationship stops being one of degree, and the mechanism is why.</w:t>
+        <w:t>The lexical result is justified by the mechanism rather than by the count. A Devanagari, Tamil or Perso-Arabic query tokenises to symbols that do not occur in an English inverted index, so there is nothing for the ranking function to score. That is why the interval is [0.000, 0.048] and why supplying an English rewrite lifts the same method to 55% immediately. Karpukhin et al. report dense retrieval as better than BM25 within a language; across scripts the relationship is not better but categorical, and the mechanism explains why.</w:t>
       </w:r>
     </w:p>
     <w:p>
@@ -3848,7 +3848,7 @@
         <w:ind w:firstLine="0"/>
       </w:pPr>
       <w:r>
-        <w:t>The rewriting result is justified by where the gain lands rather than by its size. A uniform improvement would point at a general quality effect. This one is not uniform. On photosynthesis the gain runs from 2 of 11 to 10 of 11; on the eye, whose name is ordinary vocabulary in every one of these languages, rewriting is worse than direct embedding, 5 of 11 against 9. That pattern fits the stated mechanism, which is that the rewrite normalises a compound the embedder had decomposed into the wrong constituents, and fits nothing else.</w:t>
+        <w:t>The rewriting result is justified by where the gain lands. If rewriting helped uniformly it would suggest a general quality effect. It does not: the gain is concentrated on compound terms, 2 of 11 to 10 of 11 on photosynthesis, while on the eye, whose name is ordinary vocabulary, rewriting is worse than direct embedding at 5 of 11 against 9. That pattern is consistent with the stated mechanism, that the rewrite normalises a compound the embedder decomposes into the wrong constituents, and inconsistent with a general improvement.</w:t>
       </w:r>
     </w:p>
     <w:p>
@@ -3951,7 +3951,7 @@
         <w:ind w:firstLine="0"/>
       </w:pPr>
       <w:r>
-        <w:t>This paper presented Shiksha Setu. Its corpus, its embeddings and the whole of retrieval run on the user's own machine; generation is a hosted call, and the boundary between the two is stated rather than blurred, because a platform that claims to be offline while depending on a network is making a claim a school can discover the hard way. The evaluation rests on 155 ingested textbooks and 43,621 indexed passages across all twelve classes.</w:t>
+        <w:t>This paper presented Shiksha Setu, a tutoring platform whose corpus, embeddings and retrieval run on the user's own machine and whose generation is a hosted call, with the boundary stated rather than blurred. The evaluation rests on 155 ingested textbooks and 43,621 indexed passages spanning all twelve classes.</w:t>
       </w:r>
     </w:p>
     <w:p>
@@ -3960,7 +3960,7 @@
         <w:ind w:firstLine="0"/>
       </w:pPr>
       <w:r>
-        <w:t>Four results are reported. The lexical baseline retrieves correctly for none of 77 cross-lingual queries. That is a structural failure, not a weak score, and no larger sample rescues it. Rewriting a question into English before embedding gains nineteen queries over embedding it directly, 66 of 77 against 47, and the gain sits almost entirely on morphologically compound terms. Half precision halves the embedding footprint to 1,083 MB at a mean cosine fidelity of 0.999998, which is what brings the serving pipeline inside 4 GB, verified at the kernel rather than estimated. And ingestion catches a legacy-font defect that renders 66% of Hindi textbooks as Latin gibberish while reporting that extraction succeeded.</w:t>
+        <w:t>Four results are reported. A lexical baseline retrieves correctly for none of 77 cross-lingual queries, which is a structural failure rather than a weak score. Rewriting a question into English before embedding it gains nineteen queries over embedding it directly, 66 of 77 against 47, and that gain is concentrated on morphologically compound terms. Half-precision inference halves the embedding footprint to 1,083 MB at a mean cosine fidelity of 0.999998, bringing the serving pipeline inside a 4 GB budget verified by kernel-level measurement. And ingestion detects a legacy-font defect that renders 66% of Hindi textbooks as Latin gibberish while reporting successful extraction.</w:t>
       </w:r>
     </w:p>
     <w:p>
@@ -3969,7 +3969,7 @@
         <w:ind w:firstLine="0"/>
       </w:pPr>
       <w:r>
-        <w:t>A cross-encoder re-ranker is the standard remedy for imperfect ranking. It was measured rather than assumed, and it is excluded on what the measurement returned: accuracy falls from 67 to 65 of 77, and the model does not fit beside the embedder on the device this work targets.</w:t>
+        <w:t>A cross-encoder re-ranker, the standard remedy for imperfect ranking, was measured rather than assumed and is excluded on the result: it lowers accuracy from 67 to 65 of 77 and does not fit beside the embedder on the target device.</w:t>
       </w:r>
     </w:p>
     <w:p>
@@ -4001,7 +4001,7 @@
         <w:ind w:firstLine="0"/>
       </w:pPr>
       <w:r>
-        <w:t>Three narrower directions follow from the results. The grounding negatives should come from observed hallucinations rather than from mismatching, so that the metric is calibrated against the failure it exists to catch. The query set should grow past 77, which needs native speakers of eleven languages and not more compute. And one query fails in every configuration: Urdu photosynthesis. It points at a class of Perso-Arabic technical vocabulary sharing no root with English or with the Sanskrit-derived compounds the other ten languages use, and whether a targeted lexicon closes that gap is open.</w:t>
+        <w:t>Three narrower directions follow from the results. The grounding negatives should be drawn from observed hallucinations rather than constructed by mismatching, so the metric is calibrated against the failure it is meant to catch. The query set should grow beyond 77, which needs native speakers of eleven languages rather than compute. And the single query that fails in every configuration, Urdu photosynthesis, points at a class of Perso-Arabic technical vocabulary that shares no root with either English or the Sanskrit-derived compounds the other ten languages use; whether a targeted lexicon closes that gap is an open question.</w:t>
       </w:r>
     </w:p>
     <w:p>

</xml_diff>